<commit_message>
fix color and logo app
</commit_message>
<xml_diff>
--- a/Bao_cao_mon_python.docx
+++ b/Bao_cao_mon_python.docx
@@ -117,7 +117,7 @@
           <w:szCs w:val="60"/>
         </w:rPr>
         <w:drawing>
-          <wp:inline distT="0" distB="0" distL="0" distR="0" wp14:anchorId="7B458704" wp14:editId="453C6AEE">
+          <wp:inline distT="0" distB="0" distL="0" distR="0" wp14:anchorId="7B458704" wp14:editId="70416DF2">
             <wp:extent cx="575945" cy="669290"/>
             <wp:effectExtent l="0" t="0" r="0" b="0"/>
             <wp:docPr id="2" name="Picture 2"/>
@@ -458,18 +458,6 @@
     </w:p>
     <w:p>
       <w:pPr>
-        <w:spacing w:before="60" w:after="60"/>
-        <w:jc w:val="center"/>
-        <w:rPr>
-          <w:b/>
-          <w:bCs/>
-          <w:sz w:val="36"/>
-          <w:szCs w:val="32"/>
-        </w:rPr>
-      </w:pPr>
-    </w:p>
-    <w:p>
-      <w:pPr>
         <w:pStyle w:val="DoanVB"/>
       </w:pPr>
       <w:r>
@@ -4566,7 +4554,21 @@
             <w:rStyle w:val="Hyperlink"/>
             <w:noProof/>
           </w:rPr>
-          <w:t>Hình 3.3. Giao diện Login</w:t>
+          <w:t>Hình 3.3. Giao diệ</w:t>
+        </w:r>
+        <w:r>
+          <w:rPr>
+            <w:rStyle w:val="Hyperlink"/>
+            <w:noProof/>
+          </w:rPr>
+          <w:t>n</w:t>
+        </w:r>
+        <w:r>
+          <w:rPr>
+            <w:rStyle w:val="Hyperlink"/>
+            <w:noProof/>
+          </w:rPr>
+          <w:t xml:space="preserve"> Login</w:t>
         </w:r>
         <w:r>
           <w:rPr>
@@ -5469,10 +5471,10 @@
         </w:rPr>
         <w:lastRenderedPageBreak/>
         <w:drawing>
-          <wp:inline distT="0" distB="0" distL="0" distR="0" wp14:anchorId="1A26C923" wp14:editId="6DD0B779">
-            <wp:extent cx="5940425" cy="3180715"/>
-            <wp:effectExtent l="0" t="0" r="3175" b="635"/>
-            <wp:docPr id="571862112" name="Picture 1" descr="A screenshot of a graph&#10;&#10;Description automatically generated"/>
+          <wp:inline distT="0" distB="0" distL="0" distR="0" wp14:anchorId="566EB900" wp14:editId="12D8A94D">
+            <wp:extent cx="5940425" cy="3187065"/>
+            <wp:effectExtent l="0" t="0" r="3175" b="0"/>
+            <wp:docPr id="1952000208" name="Picture 1" descr="A screenshot of a graph&#10;&#10;Description automatically generated"/>
             <wp:cNvGraphicFramePr>
               <a:graphicFrameLocks xmlns:a="http://schemas.openxmlformats.org/drawingml/2006/main" noChangeAspect="1"/>
             </wp:cNvGraphicFramePr>
@@ -5480,7 +5482,7 @@
               <a:graphicData uri="http://schemas.openxmlformats.org/drawingml/2006/picture">
                 <pic:pic xmlns:pic="http://schemas.openxmlformats.org/drawingml/2006/picture">
                   <pic:nvPicPr>
-                    <pic:cNvPr id="571862112" name="Picture 1" descr="A screenshot of a graph&#10;&#10;Description automatically generated"/>
+                    <pic:cNvPr id="1952000208" name="Picture 1" descr="A screenshot of a graph&#10;&#10;Description automatically generated"/>
                     <pic:cNvPicPr/>
                   </pic:nvPicPr>
                   <pic:blipFill>
@@ -5492,7 +5494,7 @@
                   <pic:spPr>
                     <a:xfrm>
                       <a:off x="0" y="0"/>
-                      <a:ext cx="5940425" cy="3180715"/>
+                      <a:ext cx="5940425" cy="3187065"/>
                     </a:xfrm>
                     <a:prstGeom prst="rect">
                       <a:avLst/>
@@ -5642,6 +5644,14 @@
     </w:p>
     <w:p>
       <w:pPr>
+        <w:pStyle w:val="StyleCng"/>
+      </w:pPr>
+      <w:r>
+        <w:t>Quản lý danh sách tài khoản: Cấp quản lý (Admin) có giao diện riêng để xem, thêm, sửa, xóa tài khoản của nhân viên. Hệ thống tự động kiểm tra độ dài mật khẩu (&gt; 6 ký tự) và kiểm tra chống trùng lặp tên đăng nhập (Username UNIQUE).</w:t>
+      </w:r>
+    </w:p>
+    <w:p>
+      <w:pPr>
         <w:pStyle w:val="Heading3"/>
       </w:pPr>
       <w:bookmarkStart w:id="13" w:name="_Toc231510855"/>
@@ -5700,6 +5710,7 @@
         <w:pStyle w:val="StyleCng"/>
       </w:pPr>
       <w:r>
+        <w:lastRenderedPageBreak/>
         <w:t>Cho phép tải lên và gắn hình ảnh minh họa cho từng món để giao diện bán hàng trở nên trực quan hơn.</w:t>
       </w:r>
     </w:p>
@@ -5717,14 +5728,109 @@
       </w:pPr>
       <w:bookmarkStart w:id="14" w:name="_Toc231510856"/>
       <w:r>
+        <w:t>Nhóm chức năng Quản lý Bán hàng (Point of Sale - POS)</w:t>
+      </w:r>
+      <w:bookmarkEnd w:id="14"/>
+    </w:p>
+    <w:p>
+      <w:r>
+        <w:t>Đây là phân hệ cốt lõi, hoạt động với cường độ cao nhất do nhân viên thu ngân sử dụng trực tiếp để phục vụ khách hàng.</w:t>
+      </w:r>
+    </w:p>
+    <w:p>
+      <w:pPr>
+        <w:pStyle w:val="StyleTr"/>
+      </w:pPr>
+      <w:r>
+        <w:t>Giao diện chọn món trực quan: Màn hình POS phải hiển thị danh sách các món uống dưới dạng dạng lưới (Grid/Cards) kèm hình ảnh và giá cả. Có khả năng lọc sản phẩm theo từng nhóm danh mục để tìm kiếm nhanh chóng.</w:t>
+      </w:r>
+    </w:p>
+    <w:p>
+      <w:pPr>
+        <w:pStyle w:val="StyleTr"/>
+      </w:pPr>
+      <w:r>
+        <w:t>Quản lý Giỏ hàng (Cart / Order):</w:t>
+      </w:r>
+    </w:p>
+    <w:p>
+      <w:pPr>
+        <w:pStyle w:val="StyleCng"/>
+      </w:pPr>
+      <w:r>
+        <w:t>Khi click vào một món, món đó tự động được thêm vào giỏ hàng.</w:t>
+      </w:r>
+    </w:p>
+    <w:p>
+      <w:pPr>
+        <w:pStyle w:val="StyleCng"/>
+      </w:pPr>
+      <w:r>
+        <w:t>Nhân viên có thể điều chỉnh tăng/giảm số lượng hoặc xóa món khỏi giỏ hàng nếu khách đổi ý.</w:t>
+      </w:r>
+    </w:p>
+    <w:p>
+      <w:pPr>
+        <w:pStyle w:val="StyleTr"/>
+      </w:pPr>
+      <w:r>
+        <w:t>Thanh toán và Xuất hóa đơn:</w:t>
+      </w:r>
+    </w:p>
+    <w:p>
+      <w:pPr>
+        <w:pStyle w:val="StyleCng"/>
+      </w:pPr>
+      <w:r>
+        <w:t>Hệ thống tự động tính toán tổng số tiền dựa trên đơn giá và số lượng trong giỏ.</w:t>
+      </w:r>
+    </w:p>
+    <w:p>
+      <w:pPr>
+        <w:pStyle w:val="StyleCng"/>
+      </w:pPr>
+      <w:r>
+        <w:t>Khi nhân viên bấm "Thanh toán", hệ thống sẽ ghi nhận đơn hàng (Order) vào cơ sở dữ liệu.</w:t>
+      </w:r>
+    </w:p>
+    <w:p>
+      <w:pPr>
+        <w:pStyle w:val="StyleCng"/>
+      </w:pPr>
+      <w:r>
+        <w:t>Tính năng xuất file hóa đơn: Ngay sau khi thanh toán thành công, hệ thống tự động sinh ra một biên lai dưới định dạng văn bản (ví dụ: hoadon_ORD_1.txt, hoadon_ORD_2.txt...) lưu trên máy tính, sẵn sàng cho việc in ấn vật lý đưa cho khách hàng.</w:t>
+      </w:r>
+    </w:p>
+    <w:p>
+      <w:pPr>
+        <w:pStyle w:val="StyleTr"/>
+      </w:pPr>
+      <w:r>
+        <w:t>Tích hợp thanh toán trực tuyến (QR Code): Nhằm đáp ứng xu hướng thanh toán không dùng tiền mặt, hệ thống yêu cầu ngay sau khi chốt đơn, màn hình phải tự động sinh ra một mã QR Code động (Dynamic QR). Mã này phải tự động điền sẵn số tài khoản của quán, đúng số tiền cần thanh toán và nội dung chuyển khoản để khách hàng dễ dàng quét bằng ứng dụng ngân hàng.</w:t>
+      </w:r>
+    </w:p>
+    <w:p>
+      <w:pPr>
+        <w:pStyle w:val="Heading3"/>
+      </w:pPr>
+      <w:bookmarkStart w:id="15" w:name="_Toc231510857"/>
+      <w:r>
+        <w:t>Nhóm chức năng Thống kê và Báo cáo (Reports)</w:t>
+      </w:r>
+      <w:bookmarkEnd w:id="15"/>
+    </w:p>
+    <w:p>
+      <w:r>
+        <w:t>Chức năng này giúp chủ quán nắm bắt tình hình kinh doanh một cách nhanh chóng thay vì phải cộng sổ sách.</w:t>
+      </w:r>
+    </w:p>
+    <w:p>
+      <w:pPr>
+        <w:pStyle w:val="StyleTr"/>
+      </w:pPr>
+      <w:r>
         <w:lastRenderedPageBreak/>
-        <w:t>Nhóm chức năng Quản lý Bán hàng (Point of Sale - POS)</w:t>
-      </w:r>
-      <w:bookmarkEnd w:id="14"/>
-    </w:p>
-    <w:p>
-      <w:r>
-        <w:t>Đây là phân hệ cốt lõi, hoạt động với cường độ cao nhất do nhân viên thu ngân sử dụng trực tiếp để phục vụ khách hàng.</w:t>
+        <w:t>Báo cáo doanh thu: Hệ thống truy xuất dữ liệu từ các hóa đơn đã thanh toán để tổng hợp doanh thu.</w:t>
       </w:r>
     </w:p>
     <w:p>
@@ -5732,102 +5838,6 @@
         <w:pStyle w:val="StyleTr"/>
       </w:pPr>
       <w:r>
-        <w:t>Giao diện chọn món trực quan: Màn hình POS phải hiển thị danh sách các món uống dưới dạng dạng lưới (Grid/Cards) kèm hình ảnh và giá cả. Có khả năng lọc sản phẩm theo từng nhóm danh mục để tìm kiếm nhanh chóng.</w:t>
-      </w:r>
-    </w:p>
-    <w:p>
-      <w:pPr>
-        <w:pStyle w:val="StyleTr"/>
-      </w:pPr>
-      <w:r>
-        <w:t>Quản lý Giỏ hàng (Cart / Order):</w:t>
-      </w:r>
-    </w:p>
-    <w:p>
-      <w:pPr>
-        <w:pStyle w:val="StyleCng"/>
-      </w:pPr>
-      <w:r>
-        <w:t>Khi click vào một món, món đó tự động được thêm vào giỏ hàng.</w:t>
-      </w:r>
-    </w:p>
-    <w:p>
-      <w:pPr>
-        <w:pStyle w:val="StyleCng"/>
-      </w:pPr>
-      <w:r>
-        <w:t>Nhân viên có thể điều chỉnh tăng/giảm số lượng hoặc xóa món khỏi giỏ hàng nếu khách đổi ý.</w:t>
-      </w:r>
-    </w:p>
-    <w:p>
-      <w:pPr>
-        <w:pStyle w:val="StyleTr"/>
-      </w:pPr>
-      <w:r>
-        <w:t>Thanh toán và Xuất hóa đơn:</w:t>
-      </w:r>
-    </w:p>
-    <w:p>
-      <w:pPr>
-        <w:pStyle w:val="StyleCng"/>
-      </w:pPr>
-      <w:r>
-        <w:t>Hệ thống tự động tính toán tổng số tiền dựa trên đơn giá và số lượng trong giỏ.</w:t>
-      </w:r>
-    </w:p>
-    <w:p>
-      <w:pPr>
-        <w:pStyle w:val="StyleCng"/>
-      </w:pPr>
-      <w:r>
-        <w:t>Khi nhân viên bấm "Thanh toán", hệ thống sẽ ghi nhận đơn hàng (Order) vào cơ sở dữ liệu.</w:t>
-      </w:r>
-    </w:p>
-    <w:p>
-      <w:pPr>
-        <w:pStyle w:val="StyleCng"/>
-      </w:pPr>
-      <w:r>
-        <w:t>Tính năng xuất file hóa đơn: Ngay sau khi thanh toán thành công, hệ thống tự động sinh ra một biên lai dưới định dạng văn bản (ví dụ: hoadon_ORD_1.txt, hoadon_ORD_2.txt...) lưu trên máy tính, sẵn sàng cho việc in ấn vật lý đưa cho khách hàng.</w:t>
-      </w:r>
-    </w:p>
-    <w:p>
-      <w:pPr>
-        <w:pStyle w:val="StyleTr"/>
-      </w:pPr>
-      <w:r>
-        <w:t>Tích hợp thanh toán trực tuyến (QR Code): Nhằm đáp ứng xu hướng thanh toán không dùng tiền mặt, hệ thống yêu cầu ngay sau khi chốt đơn, màn hình phải tự động sinh ra một mã QR Code động (Dynamic QR). Mã này phải tự động điền sẵn số tài khoản của quán, đúng số tiền cần thanh toán và nội dung chuyển khoản để khách hàng dễ dàng quét bằng ứng dụng ngân hàng.</w:t>
-      </w:r>
-    </w:p>
-    <w:p>
-      <w:pPr>
-        <w:pStyle w:val="Heading3"/>
-      </w:pPr>
-      <w:bookmarkStart w:id="15" w:name="_Toc231510857"/>
-      <w:r>
-        <w:t>Nhóm chức năng Thống kê và Báo cáo (Reports)</w:t>
-      </w:r>
-      <w:bookmarkEnd w:id="15"/>
-    </w:p>
-    <w:p>
-      <w:r>
-        <w:t>Chức năng này giúp chủ quán nắm bắt tình hình kinh doanh một cách nhanh chóng thay vì phải cộng sổ sách.</w:t>
-      </w:r>
-    </w:p>
-    <w:p>
-      <w:pPr>
-        <w:pStyle w:val="StyleTr"/>
-      </w:pPr>
-      <w:r>
-        <w:t>Báo cáo doanh thu: Hệ thống truy xuất dữ liệu từ các hóa đơn đã thanh toán để tổng hợp doanh thu.</w:t>
-      </w:r>
-    </w:p>
-    <w:p>
-      <w:pPr>
-        <w:pStyle w:val="StyleTr"/>
-      </w:pPr>
-      <w:r>
-        <w:lastRenderedPageBreak/>
         <w:t>Giao diện bảng biểu: Hiển thị danh sách các đơn hàng đã bán, tổng tiền thu được trong một khoảng thời gian nhất định (theo ngày, hoặc toàn thời gian) lên một bảng dữ liệu (DataGrid/Treeview) rõ ràng, minh bạch.</w:t>
       </w:r>
       <w:r>
@@ -6119,6 +6129,7 @@
         <w:pStyle w:val="StyleCng"/>
       </w:pPr>
       <w:r>
+        <w:lastRenderedPageBreak/>
         <w:t>id (INT): Khóa chính, tự động tăng IDENTITY(1,1).</w:t>
       </w:r>
     </w:p>
@@ -6127,7 +6138,6 @@
         <w:pStyle w:val="StyleCng"/>
       </w:pPr>
       <w:r>
-        <w:lastRenderedPageBreak/>
         <w:t>name (NVARCHAR(100)): Tên danh mục. Cho phép gõ tiếng Việt có dấu. Ràng buộc UNIQUE (mỗi tên danh mục là duy nhất) và NOT NULL.</w:t>
       </w:r>
     </w:p>
@@ -7247,10 +7257,10 @@
         </w:rPr>
         <w:lastRenderedPageBreak/>
         <w:drawing>
-          <wp:inline distT="0" distB="0" distL="0" distR="0" wp14:anchorId="383D2440" wp14:editId="49E97E7E">
-            <wp:extent cx="5940425" cy="4136390"/>
+          <wp:inline distT="0" distB="0" distL="0" distR="0" wp14:anchorId="33E4ABBB" wp14:editId="0718E2CC">
+            <wp:extent cx="5940425" cy="4135120"/>
             <wp:effectExtent l="0" t="0" r="3175" b="0"/>
-            <wp:docPr id="273733931" name="Picture 1"/>
+            <wp:docPr id="995109328" name="Picture 1" descr="A screen shot of a login&#10;&#10;Description automatically generated"/>
             <wp:cNvGraphicFramePr>
               <a:graphicFrameLocks xmlns:a="http://schemas.openxmlformats.org/drawingml/2006/main" noChangeAspect="1"/>
             </wp:cNvGraphicFramePr>
@@ -7258,7 +7268,7 @@
               <a:graphicData uri="http://schemas.openxmlformats.org/drawingml/2006/picture">
                 <pic:pic xmlns:pic="http://schemas.openxmlformats.org/drawingml/2006/picture">
                   <pic:nvPicPr>
-                    <pic:cNvPr id="273733931" name=""/>
+                    <pic:cNvPr id="995109328" name="Picture 1" descr="A screen shot of a login&#10;&#10;Description automatically generated"/>
                     <pic:cNvPicPr/>
                   </pic:nvPicPr>
                   <pic:blipFill>
@@ -7270,7 +7280,7 @@
                   <pic:spPr>
                     <a:xfrm>
                       <a:off x="0" y="0"/>
-                      <a:ext cx="5940425" cy="4136390"/>
+                      <a:ext cx="5940425" cy="4135120"/>
                     </a:xfrm>
                     <a:prstGeom prst="rect">
                       <a:avLst/>
@@ -7337,11 +7347,17 @@
         <w:rPr>
           <w:noProof/>
         </w:rPr>
+        <w:t xml:space="preserve">            </w:t>
+      </w:r>
+      <w:r>
+        <w:rPr>
+          <w:noProof/>
+        </w:rPr>
         <w:drawing>
-          <wp:inline distT="0" distB="0" distL="0" distR="0" wp14:anchorId="2DDC6AEB" wp14:editId="4AD30AFE">
-            <wp:extent cx="5736590" cy="2903220"/>
-            <wp:effectExtent l="0" t="0" r="0" b="0"/>
-            <wp:docPr id="535307376" name="Picture 1"/>
+          <wp:inline distT="0" distB="0" distL="0" distR="0" wp14:anchorId="6813E087" wp14:editId="7B30AF2D">
+            <wp:extent cx="4411980" cy="2818765"/>
+            <wp:effectExtent l="0" t="0" r="7620" b="635"/>
+            <wp:docPr id="1069849655" name="Picture 1" descr="A screenshot of a computer&#10;&#10;Description automatically generated"/>
             <wp:cNvGraphicFramePr>
               <a:graphicFrameLocks xmlns:a="http://schemas.openxmlformats.org/drawingml/2006/main" noChangeAspect="1"/>
             </wp:cNvGraphicFramePr>
@@ -7349,7 +7365,7 @@
               <a:graphicData uri="http://schemas.openxmlformats.org/drawingml/2006/picture">
                 <pic:pic xmlns:pic="http://schemas.openxmlformats.org/drawingml/2006/picture">
                   <pic:nvPicPr>
-                    <pic:cNvPr id="535307376" name=""/>
+                    <pic:cNvPr id="1069849655" name="Picture 1" descr="A screenshot of a computer&#10;&#10;Description automatically generated"/>
                     <pic:cNvPicPr/>
                   </pic:nvPicPr>
                   <pic:blipFill>
@@ -7361,7 +7377,7 @@
                   <pic:spPr>
                     <a:xfrm>
                       <a:off x="0" y="0"/>
-                      <a:ext cx="5805347" cy="2938017"/>
+                      <a:ext cx="4458216" cy="2848305"/>
                     </a:xfrm>
                     <a:prstGeom prst="rect">
                       <a:avLst/>
@@ -7429,10 +7445,10 @@
           <w:noProof/>
         </w:rPr>
         <w:drawing>
-          <wp:inline distT="0" distB="0" distL="0" distR="0" wp14:anchorId="4EBF33D6" wp14:editId="73D99900">
-            <wp:extent cx="5940425" cy="4112895"/>
+          <wp:inline distT="0" distB="0" distL="0" distR="0" wp14:anchorId="1E19C0B6" wp14:editId="55D69517">
+            <wp:extent cx="5940425" cy="4170045"/>
             <wp:effectExtent l="0" t="0" r="3175" b="1905"/>
-            <wp:docPr id="2048188860" name="Picture 1" descr="A screenshot of a computer&#10;&#10;Description automatically generated"/>
+            <wp:docPr id="445292041" name="Picture 1" descr="A screenshot of a computer&#10;&#10;Description automatically generated"/>
             <wp:cNvGraphicFramePr>
               <a:graphicFrameLocks xmlns:a="http://schemas.openxmlformats.org/drawingml/2006/main" noChangeAspect="1"/>
             </wp:cNvGraphicFramePr>
@@ -7440,7 +7456,7 @@
               <a:graphicData uri="http://schemas.openxmlformats.org/drawingml/2006/picture">
                 <pic:pic xmlns:pic="http://schemas.openxmlformats.org/drawingml/2006/picture">
                   <pic:nvPicPr>
-                    <pic:cNvPr id="2048188860" name="Picture 1" descr="A screenshot of a computer&#10;&#10;Description automatically generated"/>
+                    <pic:cNvPr id="445292041" name="Picture 1" descr="A screenshot of a computer&#10;&#10;Description automatically generated"/>
                     <pic:cNvPicPr/>
                   </pic:nvPicPr>
                   <pic:blipFill>
@@ -7452,7 +7468,7 @@
                   <pic:spPr>
                     <a:xfrm>
                       <a:off x="0" y="0"/>
-                      <a:ext cx="5940425" cy="4112895"/>
+                      <a:ext cx="5940425" cy="4170045"/>
                     </a:xfrm>
                     <a:prstGeom prst="rect">
                       <a:avLst/>
@@ -7521,10 +7537,10 @@
         </w:rPr>
         <w:lastRenderedPageBreak/>
         <w:drawing>
-          <wp:inline distT="0" distB="0" distL="0" distR="0" wp14:anchorId="3BEDF04C" wp14:editId="6FD2A043">
-            <wp:extent cx="5940425" cy="3194685"/>
-            <wp:effectExtent l="0" t="0" r="3175" b="5715"/>
-            <wp:docPr id="2069716968" name="Picture 1"/>
+          <wp:inline distT="0" distB="0" distL="0" distR="0" wp14:anchorId="0B0B4489" wp14:editId="07877C13">
+            <wp:extent cx="5940425" cy="3185160"/>
+            <wp:effectExtent l="0" t="0" r="3175" b="0"/>
+            <wp:docPr id="1616933222" name="Picture 1" descr="A screenshot of a computer&#10;&#10;Description automatically generated"/>
             <wp:cNvGraphicFramePr>
               <a:graphicFrameLocks xmlns:a="http://schemas.openxmlformats.org/drawingml/2006/main" noChangeAspect="1"/>
             </wp:cNvGraphicFramePr>
@@ -7532,7 +7548,7 @@
               <a:graphicData uri="http://schemas.openxmlformats.org/drawingml/2006/picture">
                 <pic:pic xmlns:pic="http://schemas.openxmlformats.org/drawingml/2006/picture">
                   <pic:nvPicPr>
-                    <pic:cNvPr id="2069716968" name=""/>
+                    <pic:cNvPr id="1616933222" name="Picture 1" descr="A screenshot of a computer&#10;&#10;Description automatically generated"/>
                     <pic:cNvPicPr/>
                   </pic:nvPicPr>
                   <pic:blipFill>
@@ -7544,7 +7560,7 @@
                   <pic:spPr>
                     <a:xfrm>
                       <a:off x="0" y="0"/>
-                      <a:ext cx="5940425" cy="3194685"/>
+                      <a:ext cx="5940425" cy="3185160"/>
                     </a:xfrm>
                     <a:prstGeom prst="rect">
                       <a:avLst/>
@@ -15780,14 +15796,6 @@
 </file>
 
 <file path=customXml/item1.xml><?xml version="1.0" encoding="utf-8"?>
-<p:properties xmlns:p="http://schemas.microsoft.com/office/2006/metadata/properties" xmlns:xsi="http://www.w3.org/2001/XMLSchema-instance" xmlns:pc="http://schemas.microsoft.com/office/infopath/2007/PartnerControls">
-  <documentManagement>
-    <_activity xmlns="26a14e9a-de4a-4945-ad9a-cd84d94bf975" xsi:nil="true"/>
-  </documentManagement>
-</p:properties>
-</file>
-
-<file path=customXml/item2.xml><?xml version="1.0" encoding="utf-8"?>
 <s:customData xmlns="http://www.wps.cn/officeDocument/2013/wpsCustomData" xmlns:s="http://www.wps.cn/officeDocument/2013/wpsCustomData">
   <customSectProps>
     <customSectPr/>
@@ -15799,20 +15807,15 @@
 </s:customData>
 </file>
 
-<file path=customXml/item3.xml><?xml version="1.0" encoding="utf-8"?>
-<?mso-contentType ?>
-<FormTemplates xmlns="http://schemas.microsoft.com/sharepoint/v3/contenttype/forms">
-  <Display>DocumentLibraryForm</Display>
-  <Edit>DocumentLibraryForm</Edit>
-  <New>DocumentLibraryForm</New>
-</FormTemplates>
+<file path=customXml/item2.xml><?xml version="1.0" encoding="utf-8"?>
+<p:properties xmlns:p="http://schemas.microsoft.com/office/2006/metadata/properties" xmlns:xsi="http://www.w3.org/2001/XMLSchema-instance" xmlns:pc="http://schemas.microsoft.com/office/infopath/2007/PartnerControls">
+  <documentManagement>
+    <_activity xmlns="26a14e9a-de4a-4945-ad9a-cd84d94bf975" xsi:nil="true"/>
+  </documentManagement>
+</p:properties>
 </file>
 
-<file path=customXml/item4.xml><?xml version="1.0" encoding="utf-8"?>
-<b:Sources xmlns:b="http://schemas.openxmlformats.org/officeDocument/2006/bibliography" xmlns="http://schemas.openxmlformats.org/officeDocument/2006/bibliography" SelectedStyle="\APASixthEditionOfficeOnline.xsl" StyleName="APA" Version="6"/>
-</file>
-
-<file path=customXml/item5.xml><?xml version="1.0" encoding="utf-8"?>
+<file path=customXml/item3.xml><?xml version="1.0" encoding="utf-8"?>
 <ct:contentTypeSchema xmlns:ct="http://schemas.microsoft.com/office/2006/metadata/contentType" xmlns:ma="http://schemas.microsoft.com/office/2006/metadata/properties/metaAttributes" ct:_="" ma:_="" ma:contentTypeName="Document" ma:contentTypeID="0x0101006F92872E82E1BD40839A40746A3229E7" ma:contentTypeVersion="13" ma:contentTypeDescription="Create a new document." ma:contentTypeScope="" ma:versionID="636aa1bdf7e3b4701f32757ad013f45c">
   <xsd:schema xmlns:xsd="http://www.w3.org/2001/XMLSchema" xmlns:xs="http://www.w3.org/2001/XMLSchema" xmlns:p="http://schemas.microsoft.com/office/2006/metadata/properties" xmlns:ns3="26a14e9a-de4a-4945-ad9a-cd84d94bf975" xmlns:ns4="22c22d51-8da4-40fe-b4cd-925df04a8665" targetNamespace="http://schemas.microsoft.com/office/2006/metadata/properties" ma:root="true" ma:fieldsID="0978d432a1d24854a31784d4c9c6b41a" ns3:_="" ns4:_="">
     <xsd:import namespace="26a14e9a-de4a-4945-ad9a-cd84d94bf975"/>
@@ -16033,7 +16036,28 @@
 </ct:contentTypeSchema>
 </file>
 
+<file path=customXml/item4.xml><?xml version="1.0" encoding="utf-8"?>
+<b:Sources xmlns:b="http://schemas.openxmlformats.org/officeDocument/2006/bibliography" xmlns="http://schemas.openxmlformats.org/officeDocument/2006/bibliography" SelectedStyle="\APASixthEditionOfficeOnline.xsl" StyleName="APA" Version="6"/>
+</file>
+
+<file path=customXml/item5.xml><?xml version="1.0" encoding="utf-8"?>
+<?mso-contentType ?>
+<FormTemplates xmlns="http://schemas.microsoft.com/sharepoint/v3/contenttype/forms">
+  <Display>DocumentLibraryForm</Display>
+  <Edit>DocumentLibraryForm</Edit>
+  <New>DocumentLibraryForm</New>
+</FormTemplates>
+</file>
+
 <file path=customXml/itemProps1.xml><?xml version="1.0" encoding="utf-8"?>
+<ds:datastoreItem xmlns:ds="http://schemas.openxmlformats.org/officeDocument/2006/customXml" ds:itemID="{B1977F7D-205B-4081-913C-38D41E755F92}">
+  <ds:schemaRefs>
+    <ds:schemaRef ds:uri="http://www.wps.cn/officeDocument/2013/wpsCustomData"/>
+  </ds:schemaRefs>
+</ds:datastoreItem>
+</file>
+
+<file path=customXml/itemProps2.xml><?xml version="1.0" encoding="utf-8"?>
 <ds:datastoreItem xmlns:ds="http://schemas.openxmlformats.org/officeDocument/2006/customXml" ds:itemID="{D1882290-71A0-4871-B10B-40F71E55079C}">
   <ds:schemaRefs>
     <ds:schemaRef ds:uri="http://schemas.microsoft.com/office/2006/metadata/properties"/>
@@ -16043,31 +16067,7 @@
 </ds:datastoreItem>
 </file>
 
-<file path=customXml/itemProps2.xml><?xml version="1.0" encoding="utf-8"?>
-<ds:datastoreItem xmlns:ds="http://schemas.openxmlformats.org/officeDocument/2006/customXml" ds:itemID="{B1977F7D-205B-4081-913C-38D41E755F92}">
-  <ds:schemaRefs>
-    <ds:schemaRef ds:uri="http://www.wps.cn/officeDocument/2013/wpsCustomData"/>
-  </ds:schemaRefs>
-</ds:datastoreItem>
-</file>
-
 <file path=customXml/itemProps3.xml><?xml version="1.0" encoding="utf-8"?>
-<ds:datastoreItem xmlns:ds="http://schemas.openxmlformats.org/officeDocument/2006/customXml" ds:itemID="{DFC101A0-1B02-4FB8-B315-F21695249D13}">
-  <ds:schemaRefs>
-    <ds:schemaRef ds:uri="http://schemas.microsoft.com/sharepoint/v3/contenttype/forms"/>
-  </ds:schemaRefs>
-</ds:datastoreItem>
-</file>
-
-<file path=customXml/itemProps4.xml><?xml version="1.0" encoding="utf-8"?>
-<ds:datastoreItem xmlns:ds="http://schemas.openxmlformats.org/officeDocument/2006/customXml" ds:itemID="{71203D9E-AD2D-40D8-B551-F7ED9FAC6436}">
-  <ds:schemaRefs>
-    <ds:schemaRef ds:uri="http://schemas.openxmlformats.org/officeDocument/2006/bibliography"/>
-  </ds:schemaRefs>
-</ds:datastoreItem>
-</file>
-
-<file path=customXml/itemProps5.xml><?xml version="1.0" encoding="utf-8"?>
 <ds:datastoreItem xmlns:ds="http://schemas.openxmlformats.org/officeDocument/2006/customXml" ds:itemID="{2608F0B1-2C03-4DCE-915B-85225E5AFCA5}">
   <ds:schemaRefs>
     <ds:schemaRef ds:uri="http://schemas.microsoft.com/office/2006/metadata/contentType"/>
@@ -16084,4 +16084,20 @@
     <ds:schemaRef ds:uri="http://schemas.microsoft.com/internal/obd"/>
   </ds:schemaRefs>
 </ds:datastoreItem>
+</file>
+
+<file path=customXml/itemProps4.xml><?xml version="1.0" encoding="utf-8"?>
+<ds:datastoreItem xmlns:ds="http://schemas.openxmlformats.org/officeDocument/2006/customXml" ds:itemID="{71203D9E-AD2D-40D8-B551-F7ED9FAC6436}">
+  <ds:schemaRefs>
+    <ds:schemaRef ds:uri="http://schemas.openxmlformats.org/officeDocument/2006/bibliography"/>
+  </ds:schemaRefs>
+</ds:datastoreItem>
+</file>
+
+<file path=customXml/itemProps5.xml><?xml version="1.0" encoding="utf-8"?>
+<ds:datastoreItem xmlns:ds="http://schemas.openxmlformats.org/officeDocument/2006/customXml" ds:itemID="{DFC101A0-1B02-4FB8-B315-F21695249D13}">
+  <ds:schemaRefs>
+    <ds:schemaRef ds:uri="http://schemas.microsoft.com/sharepoint/v3/contenttype/forms"/>
+  </ds:schemaRefs>
+</ds:datastoreItem>
 </file>
</xml_diff>